<commit_message>
Update VPS guide for 4 GB RAM / 80 GB server
Co-Authored-By: Claude Opus 5.5 <noreply@anthropic.com>
Claude-Session: https://claude.ai/code/session_019V7Y2epHyrvkwtQ3fJYsd7
</commit_message>
<xml_diff>
--- a/docs/VPS-ornatish.docx
+++ b/docs/VPS-ornatish.docx
@@ -19,7 +19,7 @@
           <w:i/>
           <w:iCs/>
         </w:rPr>
-        <w:t xml:space="preserve">Eskiz.uz VPS (2 yadro, 2 GB RAM, 40 GB NVMe) va Ubuntu 22.04/24.04 uchun. Buyruqlarni ketma-ket bajaring. KUCHLI_PAROL, kassa.example.uz va &lt;...&gt; belgilangan joylarni o‘z qiymatlaringizga almashtiring.</w:t>
+        <w:t xml:space="preserve">Eskiz.uz VPS (2 yadro, 4 GB RAM, 80 GB NVMe) va Ubuntu 22.04/24.04 uchun. Buyruqlarni ketma-ket bajaring. KUCHLI_PAROL, kassa.example.uz va &lt;...&gt; belgilangan joylarni o‘z qiymatlaringizga almashtiring.</w:t>
       </w:r>
     </w:p>
     <w:p>
@@ -28,7 +28,7 @@
         <w:spacing w:after="120" w:before="300"/>
       </w:pPr>
       <w:r>
-        <w:t xml:space="preserve">1. Swap qo‘shish (2 GB RAM’da build uchun kerak)</w:t>
+        <w:t xml:space="preserve">1. Swap qo‘shish (ixtiyoriy, lekin tavsiya etiladi)</w:t>
       </w:r>
     </w:p>
     <w:p>

</xml_diff>